<commit_message>
Remove accidentally generated files
</commit_message>
<xml_diff>
--- a/Kaustubh_Rajput_AAI_Assignment_4.docx
+++ b/Kaustubh_Rajput_AAI_Assignment_4.docx
@@ -57,7 +57,10 @@
         <w:jc w:val="center"/>
       </w:pPr>
       <w:r>
-        <w:t>July 21, 2026</w:t>
+        <w:t>August 1</w:t>
+      </w:r>
+      <w:r>
+        <w:t>1, 2026</w:t>
       </w:r>
     </w:p>
     <w:p>

</xml_diff>